<commit_message>
Issue 1 — password reset loop Issue 2 — User Accounts table clipped, no scrollbar
</commit_message>
<xml_diff>
--- a/Troubleshooting.docx
+++ b/Troubleshooting.docx
@@ -53,7 +53,87 @@
       </w:r>
     </w:p>
     <w:p/>
+    <w:p>
+      <w:r>
+        <w:t>*</w:t>
+      </w:r>
+      <w:r>
+        <w:br/>
+      </w:r>
+      <w:r>
+        <w:rPr>
+          <w:noProof/>
+        </w:rPr>
+        <w:drawing>
+          <wp:inline distT="0" distB="0" distL="0" distR="0" wp14:anchorId="6C636549" wp14:editId="16E8BB54">
+            <wp:extent cx="5943600" cy="3343275"/>
+            <wp:effectExtent l="0" t="0" r="0" b="9525"/>
+            <wp:docPr id="920708663" name="Picture 1"/>
+            <wp:cNvGraphicFramePr>
+              <a:graphicFrameLocks xmlns:a="http://schemas.openxmlformats.org/drawingml/2006/main" noChangeAspect="1"/>
+            </wp:cNvGraphicFramePr>
+            <a:graphic xmlns:a="http://schemas.openxmlformats.org/drawingml/2006/main">
+              <a:graphicData uri="http://schemas.openxmlformats.org/drawingml/2006/picture">
+                <pic:pic xmlns:pic="http://schemas.openxmlformats.org/drawingml/2006/picture">
+                  <pic:nvPicPr>
+                    <pic:cNvPr id="920708663" name=""/>
+                    <pic:cNvPicPr/>
+                  </pic:nvPicPr>
+                  <pic:blipFill>
+                    <a:blip r:embed="rId5"/>
+                    <a:stretch>
+                      <a:fillRect/>
+                    </a:stretch>
+                  </pic:blipFill>
+                  <pic:spPr>
+                    <a:xfrm>
+                      <a:off x="0" y="0"/>
+                      <a:ext cx="5943600" cy="3343275"/>
+                    </a:xfrm>
+                    <a:prstGeom prst="rect">
+                      <a:avLst/>
+                    </a:prstGeom>
+                  </pic:spPr>
+                </pic:pic>
+              </a:graphicData>
+            </a:graphic>
+          </wp:inline>
+        </w:drawing>
+      </w:r>
+    </w:p>
     <w:p/>
+    <w:p>
+      <w:r>
+        <w:t xml:space="preserve">Here in the add new template in the pm view I </w:t>
+      </w:r>
+      <w:proofErr w:type="gramStart"/>
+      <w:r>
+        <w:t>cant</w:t>
+      </w:r>
+      <w:proofErr w:type="gramEnd"/>
+      <w:r>
+        <w:t xml:space="preserve"> see the items that will be added in the template only a name and description</w:t>
+      </w:r>
+    </w:p>
+    <w:p/>
+    <w:p>
+      <w:proofErr w:type="gramStart"/>
+      <w:r>
+        <w:t>Also</w:t>
+      </w:r>
+      <w:proofErr w:type="gramEnd"/>
+      <w:r>
+        <w:t xml:space="preserve"> I don’t understand what we have fixed now as from what I understand that there will be an export setting file that will contain everything that the pm configures and then the coordinator will import it if this is correct from where can I do this and if </w:t>
+      </w:r>
+      <w:proofErr w:type="gramStart"/>
+      <w:r>
+        <w:t>not</w:t>
+      </w:r>
+      <w:proofErr w:type="gramEnd"/>
+      <w:r>
+        <w:t xml:space="preserve"> how will it work</w:t>
+      </w:r>
+    </w:p>
     <w:sectPr>
       <w:pgSz w:w="12240" w:h="15840"/>
       <w:pgMar w:top="1440" w:right="1440" w:bottom="1440" w:left="1440" w:header="720" w:footer="720" w:gutter="0"/>

</xml_diff>